<commit_message>
Documented Northwind clarifications with own comments to review w team
</commit_message>
<xml_diff>
--- a/docs/business/BRD-Northwind-Outdoors-03082026.docx
+++ b/docs/business/BRD-Northwind-Outdoors-03082026.docx
@@ -162,7 +162,23 @@
                 <w:bCs/>
                 <w:lang w:val="en-US"/>
               </w:rPr>
-              <w:t>IT Infrastructure Modernisation Project</w:t>
+              <w:t xml:space="preserve">IT Infrastructure </w:t>
+            </w:r>
+            <w:proofErr w:type="spellStart"/>
+            <w:r>
+              <w:rPr>
+                <w:bCs/>
+                <w:lang w:val="en-US"/>
+              </w:rPr>
+              <w:t>Modernisation</w:t>
+            </w:r>
+            <w:proofErr w:type="spellEnd"/>
+            <w:r>
+              <w:rPr>
+                <w:bCs/>
+                <w:lang w:val="en-US"/>
+              </w:rPr>
+              <w:t xml:space="preserve"> Project</w:t>
             </w:r>
           </w:p>
         </w:tc>
@@ -3048,13 +3064,6 @@
           <w:lang w:val="en-US"/>
         </w:rPr>
       </w:pPr>
-    </w:p>
-    <w:p>
-      <w:pPr>
-        <w:rPr>
-          <w:lang w:val="en-US"/>
-        </w:rPr>
-      </w:pPr>
       <w:r>
         <w:rPr>
           <w:lang w:val="en-US"/>
@@ -3139,13 +3148,6 @@
         </w:rPr>
         <w:t>system.</w:t>
       </w:r>
-    </w:p>
-    <w:p>
-      <w:pPr>
-        <w:rPr>
-          <w:lang w:val="en-US"/>
-        </w:rPr>
-      </w:pPr>
     </w:p>
     <w:p>
       <w:pPr>
@@ -3721,6 +3723,7 @@
     <w:p/>
     <w:p/>
     <w:p/>
+    <w:p/>
     <w:p>
       <w:pPr>
         <w:pStyle w:val="Heading2"/>
@@ -7637,7 +7640,23 @@
           <w:i/>
           <w:iCs/>
         </w:rPr>
-        <w:t>Detail all non-functional requirements (NFRs) of the project, including such things as features, system behavior, and project characteristics that relate to user experience.</w:t>
+        <w:t xml:space="preserve">Detail all non-functional requirements (NFRs) of the project, including such things as features, system </w:t>
+      </w:r>
+      <w:proofErr w:type="spellStart"/>
+      <w:r>
+        <w:rPr>
+          <w:i/>
+          <w:iCs/>
+        </w:rPr>
+        <w:t>behavior</w:t>
+      </w:r>
+      <w:proofErr w:type="spellEnd"/>
+      <w:r>
+        <w:rPr>
+          <w:i/>
+          <w:iCs/>
+        </w:rPr>
+        <w:t>, and project characteristics that relate to user experience.</w:t>
       </w:r>
     </w:p>
     <w:tbl>
@@ -9752,7 +9771,15 @@
           </w:tcPr>
           <w:p>
             <w:r>
-              <w:t>Redstone Lead Consultant</w:t>
+              <w:t xml:space="preserve">Redstone </w:t>
+            </w:r>
+            <w:proofErr w:type="gramStart"/>
+            <w:r>
+              <w:t>Lead</w:t>
+            </w:r>
+            <w:proofErr w:type="gramEnd"/>
+            <w:r>
+              <w:t xml:space="preserve"> Consultant</w:t>
             </w:r>
           </w:p>
         </w:tc>
@@ -11326,9 +11353,11 @@
             <w:hideMark/>
           </w:tcPr>
           <w:p>
+            <w:proofErr w:type="spellStart"/>
             <w:r>
               <w:t>MoSCoW</w:t>
             </w:r>
+            <w:proofErr w:type="spellEnd"/>
           </w:p>
         </w:tc>
         <w:tc>
@@ -11610,7 +11639,6 @@
         <w:docPartUnique/>
       </w:docPartObj>
     </w:sdtPr>
-    <w:sdtEndPr/>
     <w:sdtContent>
       <w:sdt>
         <w:sdtPr>
@@ -11620,7 +11648,6 @@
             <w:docPartUnique/>
           </w:docPartObj>
         </w:sdtPr>
-        <w:sdtEndPr/>
         <w:sdtContent>
           <w:p>
             <w:pPr>

</xml_diff>